<commit_message>
changes in arrays single dimensional theory
</commit_message>
<xml_diff>
--- a/TheorynCoding/Study Material/Java Overall/Java Overall/Core java/Arrays Single Dimensional/Arrays Single Dimensional - Theory.docx
+++ b/TheorynCoding/Study Material/Java Overall/Java Overall/Core java/Arrays Single Dimensional/Arrays Single Dimensional - Theory.docx
@@ -15780,7 +15780,7 @@
       </w:pPr>
       <w:r>
         <w:pict>
-          <v:rect id="_x0000_i1133" style="width:0;height:1.5pt" o:hralign="center" o:hrstd="t" o:hr="t" fillcolor="#a0a0a0" stroked="f"/>
+          <v:rect id="_x0000_i1086" style="width:0;height:1.5pt" o:hralign="center" o:hrstd="t" o:hr="t" fillcolor="#a0a0a0" stroked="f"/>
         </w:pict>
       </w:r>
     </w:p>
@@ -16304,7 +16304,7 @@
       </w:pPr>
       <w:r>
         <w:pict>
-          <v:rect id="_x0000_i1134" style="width:0;height:1.5pt" o:hralign="center" o:hrstd="t" o:hr="t" fillcolor="#a0a0a0" stroked="f"/>
+          <v:rect id="_x0000_i1087" style="width:0;height:1.5pt" o:hralign="center" o:hrstd="t" o:hr="t" fillcolor="#a0a0a0" stroked="f"/>
         </w:pict>
       </w:r>
     </w:p>
@@ -16641,7 +16641,7 @@
       </w:pPr>
       <w:r>
         <w:pict>
-          <v:rect id="_x0000_i1135" style="width:0;height:1.5pt" o:hralign="center" o:hrstd="t" o:hr="t" fillcolor="#a0a0a0" stroked="f"/>
+          <v:rect id="_x0000_i1088" style="width:0;height:1.5pt" o:hralign="center" o:hrstd="t" o:hr="t" fillcolor="#a0a0a0" stroked="f"/>
         </w:pict>
       </w:r>
     </w:p>
@@ -16992,7 +16992,7 @@
       </w:pPr>
       <w:r>
         <w:pict>
-          <v:rect id="_x0000_i1136" style="width:0;height:1.5pt" o:hralign="center" o:hrstd="t" o:hr="t" fillcolor="#a0a0a0" stroked="f"/>
+          <v:rect id="_x0000_i1089" style="width:0;height:1.5pt" o:hralign="center" o:hrstd="t" o:hr="t" fillcolor="#a0a0a0" stroked="f"/>
         </w:pict>
       </w:r>
     </w:p>
@@ -17192,7 +17192,7 @@
       </w:pPr>
       <w:r>
         <w:pict>
-          <v:rect id="_x0000_i1137" style="width:0;height:1.5pt" o:hralign="center" o:hrstd="t" o:hr="t" fillcolor="#a0a0a0" stroked="f"/>
+          <v:rect id="_x0000_i1090" style="width:0;height:1.5pt" o:hralign="center" o:hrstd="t" o:hr="t" fillcolor="#a0a0a0" stroked="f"/>
         </w:pict>
       </w:r>
     </w:p>
@@ -17385,7 +17385,7 @@
       </w:pPr>
       <w:r>
         <w:pict>
-          <v:rect id="_x0000_i1138" style="width:0;height:1.5pt" o:hralign="center" o:hrstd="t" o:hr="t" fillcolor="#a0a0a0" stroked="f"/>
+          <v:rect id="_x0000_i1091" style="width:0;height:1.5pt" o:hralign="center" o:hrstd="t" o:hr="t" fillcolor="#a0a0a0" stroked="f"/>
         </w:pict>
       </w:r>
     </w:p>
@@ -17412,7 +17412,7 @@
           <w:lang w:eastAsia="en-IN"/>
         </w:rPr>
         <w:pict>
-          <v:rect id="_x0000_i1086" style="width:0;height:1.5pt" o:hralign="center" o:hrstd="t" o:hr="t" fillcolor="#a0a0a0" stroked="f"/>
+          <v:rect id="_x0000_i1092" style="width:0;height:1.5pt" o:hralign="center" o:hrstd="t" o:hr="t" fillcolor="#a0a0a0" stroked="f"/>
         </w:pict>
       </w:r>
     </w:p>
@@ -17927,7 +17927,7 @@
       </w:pPr>
       <w:r>
         <w:pict>
-          <v:rect id="_x0000_i1139" style="width:0;height:1.5pt" o:hralign="center" o:hrstd="t" o:hr="t" fillcolor="#a0a0a0" stroked="f"/>
+          <v:rect id="_x0000_i1093" style="width:0;height:1.5pt" o:hralign="center" o:hrstd="t" o:hr="t" fillcolor="#a0a0a0" stroked="f"/>
         </w:pict>
       </w:r>
     </w:p>
@@ -18119,7 +18119,7 @@
       </w:pPr>
       <w:r>
         <w:pict>
-          <v:rect id="_x0000_i1140" style="width:0;height:1.5pt" o:hralign="center" o:hrstd="t" o:hr="t" fillcolor="#a0a0a0" stroked="f"/>
+          <v:rect id="_x0000_i1094" style="width:0;height:1.5pt" o:hralign="center" o:hrstd="t" o:hr="t" fillcolor="#a0a0a0" stroked="f"/>
         </w:pict>
       </w:r>
     </w:p>
@@ -18328,7 +18328,7 @@
       </w:pPr>
       <w:r>
         <w:pict>
-          <v:rect id="_x0000_i1141" style="width:0;height:1.5pt" o:hralign="center" o:hrstd="t" o:hr="t" fillcolor="#a0a0a0" stroked="f"/>
+          <v:rect id="_x0000_i1095" style="width:0;height:1.5pt" o:hralign="center" o:hrstd="t" o:hr="t" fillcolor="#a0a0a0" stroked="f"/>
         </w:pict>
       </w:r>
     </w:p>
@@ -18443,7 +18443,7 @@
       <w:r>
         <w:lastRenderedPageBreak/>
         <w:pict>
-          <v:rect id="_x0000_i1142" style="width:0;height:1.5pt" o:hralign="center" o:hrstd="t" o:hr="t" fillcolor="#a0a0a0" stroked="f"/>
+          <v:rect id="_x0000_i1096" style="width:0;height:1.5pt" o:hralign="center" o:hrstd="t" o:hr="t" fillcolor="#a0a0a0" stroked="f"/>
         </w:pict>
       </w:r>
     </w:p>
@@ -18624,7 +18624,7 @@
       </w:pPr>
       <w:r>
         <w:pict>
-          <v:rect id="_x0000_i1143" style="width:0;height:1.5pt" o:hralign="center" o:hrstd="t" o:hr="t" fillcolor="#a0a0a0" stroked="f"/>
+          <v:rect id="_x0000_i1097" style="width:0;height:1.5pt" o:hralign="center" o:hrstd="t" o:hr="t" fillcolor="#a0a0a0" stroked="f"/>
         </w:pict>
       </w:r>
     </w:p>
@@ -18880,7 +18880,7 @@
       </w:pPr>
       <w:r>
         <w:pict>
-          <v:rect id="_x0000_i1144" style="width:0;height:1.5pt" o:hralign="center" o:hrstd="t" o:hr="t" fillcolor="#a0a0a0" stroked="f"/>
+          <v:rect id="_x0000_i1098" style="width:0;height:1.5pt" o:hralign="center" o:hrstd="t" o:hr="t" fillcolor="#a0a0a0" stroked="f"/>
         </w:pict>
       </w:r>
     </w:p>
@@ -19024,7 +19024,7 @@
       </w:pPr>
       <w:r>
         <w:pict>
-          <v:rect id="_x0000_i1145" style="width:0;height:1.5pt" o:hralign="center" o:hrstd="t" o:hr="t" fillcolor="#a0a0a0" stroked="f"/>
+          <v:rect id="_x0000_i1099" style="width:0;height:1.5pt" o:hralign="center" o:hrstd="t" o:hr="t" fillcolor="#a0a0a0" stroked="f"/>
         </w:pict>
       </w:r>
     </w:p>
@@ -19184,7 +19184,7 @@
       <w:r>
         <w:lastRenderedPageBreak/>
         <w:pict>
-          <v:rect id="_x0000_i1146" style="width:0;height:1.5pt" o:hralign="center" o:hrstd="t" o:hr="t" fillcolor="#a0a0a0" stroked="f"/>
+          <v:rect id="_x0000_i1100" style="width:0;height:1.5pt" o:hralign="center" o:hrstd="t" o:hr="t" fillcolor="#a0a0a0" stroked="f"/>
         </w:pict>
       </w:r>
     </w:p>
@@ -19446,7 +19446,7 @@
           <w:lang w:eastAsia="en-IN"/>
         </w:rPr>
         <w:pict>
-          <v:rect id="_x0000_i1087" style="width:0;height:1.5pt" o:hralign="center" o:hrstd="t" o:hr="t" fillcolor="#a0a0a0" stroked="f"/>
+          <v:rect id="_x0000_i1101" style="width:0;height:1.5pt" o:hralign="center" o:hrstd="t" o:hr="t" fillcolor="#a0a0a0" stroked="f"/>
         </w:pict>
       </w:r>
     </w:p>
@@ -20042,7 +20042,7 @@
           <w:lang w:eastAsia="en-IN"/>
         </w:rPr>
         <w:pict>
-          <v:rect id="_x0000_i1088" style="width:0;height:1.5pt" o:hralign="center" o:hrstd="t" o:hr="t" fillcolor="#a0a0a0" stroked="f"/>
+          <v:rect id="_x0000_i1102" style="width:0;height:1.5pt" o:hralign="center" o:hrstd="t" o:hr="t" fillcolor="#a0a0a0" stroked="f"/>
         </w:pict>
       </w:r>
     </w:p>
@@ -20681,7 +20681,7 @@
     <w:p>
       <w:r>
         <w:pict>
-          <v:rect id="_x0000_i1147" style="width:0;height:1.5pt" o:hralign="center" o:hrstd="t" o:hr="t" fillcolor="#a0a0a0" stroked="f"/>
+          <v:rect id="_x0000_i1103" style="width:0;height:1.5pt" o:hralign="center" o:hrstd="t" o:hr="t" fillcolor="#a0a0a0" stroked="f"/>
         </w:pict>
       </w:r>
     </w:p>
@@ -21011,7 +21011,7 @@
     <w:p>
       <w:r>
         <w:pict>
-          <v:rect id="_x0000_i1148" style="width:0;height:1.5pt" o:hralign="center" o:hrstd="t" o:hr="t" fillcolor="#a0a0a0" stroked="f"/>
+          <v:rect id="_x0000_i1104" style="width:0;height:1.5pt" o:hralign="center" o:hrstd="t" o:hr="t" fillcolor="#a0a0a0" stroked="f"/>
         </w:pict>
       </w:r>
     </w:p>
@@ -21538,7 +21538,7 @@
     <w:p>
       <w:r>
         <w:pict>
-          <v:rect id="_x0000_i1149" style="width:0;height:1.5pt" o:hralign="center" o:hrstd="t" o:hr="t" fillcolor="#a0a0a0" stroked="f"/>
+          <v:rect id="_x0000_i1105" style="width:0;height:1.5pt" o:hralign="center" o:hrstd="t" o:hr="t" fillcolor="#a0a0a0" stroked="f"/>
         </w:pict>
       </w:r>
     </w:p>
@@ -21945,7 +21945,7 @@
     <w:p>
       <w:r>
         <w:pict>
-          <v:rect id="_x0000_i1150" style="width:0;height:1.5pt" o:hralign="center" o:hrstd="t" o:hr="t" fillcolor="#a0a0a0" stroked="f"/>
+          <v:rect id="_x0000_i1106" style="width:0;height:1.5pt" o:hralign="center" o:hrstd="t" o:hr="t" fillcolor="#a0a0a0" stroked="f"/>
         </w:pict>
       </w:r>
     </w:p>
@@ -22214,7 +22214,7 @@
     <w:p>
       <w:r>
         <w:pict>
-          <v:rect id="_x0000_i1151" style="width:0;height:1.5pt" o:hralign="center" o:hrstd="t" o:hr="t" fillcolor="#a0a0a0" stroked="f"/>
+          <v:rect id="_x0000_i1107" style="width:0;height:1.5pt" o:hralign="center" o:hrstd="t" o:hr="t" fillcolor="#a0a0a0" stroked="f"/>
         </w:pict>
       </w:r>
     </w:p>
@@ -22237,7 +22237,7 @@
     <w:p>
       <w:r>
         <w:pict>
-          <v:rect id="_x0000_i1152" style="width:0;height:1.5pt" o:hralign="center" o:hrstd="t" o:hr="t" fillcolor="#a0a0a0" stroked="f"/>
+          <v:rect id="_x0000_i1108" style="width:0;height:1.5pt" o:hralign="center" o:hrstd="t" o:hr="t" fillcolor="#a0a0a0" stroked="f"/>
         </w:pict>
       </w:r>
     </w:p>
@@ -22669,7 +22669,7 @@
       <w:r>
         <w:lastRenderedPageBreak/>
         <w:pict>
-          <v:rect id="_x0000_i1153" style="width:0;height:1.5pt" o:hralign="center" o:hrstd="t" o:hr="t" fillcolor="#a0a0a0" stroked="f"/>
+          <v:rect id="_x0000_i1109" style="width:0;height:1.5pt" o:hralign="center" o:hrstd="t" o:hr="t" fillcolor="#a0a0a0" stroked="f"/>
         </w:pict>
       </w:r>
     </w:p>
@@ -23009,7 +23009,7 @@
     <w:p>
       <w:r>
         <w:pict>
-          <v:rect id="_x0000_i1154" style="width:0;height:1.5pt" o:hralign="center" o:hrstd="t" o:hr="t" fillcolor="#a0a0a0" stroked="f"/>
+          <v:rect id="_x0000_i1110" style="width:0;height:1.5pt" o:hralign="center" o:hrstd="t" o:hr="t" fillcolor="#a0a0a0" stroked="f"/>
         </w:pict>
       </w:r>
     </w:p>
@@ -23467,7 +23467,7 @@
     <w:p>
       <w:r>
         <w:pict>
-          <v:rect id="_x0000_i1155" style="width:0;height:1.5pt" o:hralign="center" o:hrstd="t" o:hr="t" fillcolor="#a0a0a0" stroked="f"/>
+          <v:rect id="_x0000_i1111" style="width:0;height:1.5pt" o:hralign="center" o:hrstd="t" o:hr="t" fillcolor="#a0a0a0" stroked="f"/>
         </w:pict>
       </w:r>
     </w:p>
@@ -23581,7 +23581,7 @@
     <w:p>
       <w:r>
         <w:pict>
-          <v:rect id="_x0000_i1156" style="width:0;height:1.5pt" o:hralign="center" o:hrstd="t" o:hr="t" fillcolor="#a0a0a0" stroked="f"/>
+          <v:rect id="_x0000_i1112" style="width:0;height:1.5pt" o:hralign="center" o:hrstd="t" o:hr="t" fillcolor="#a0a0a0" stroked="f"/>
         </w:pict>
       </w:r>
     </w:p>
@@ -23661,7 +23661,7 @@
     <w:p>
       <w:r>
         <w:pict>
-          <v:rect id="_x0000_i1157" style="width:0;height:1.5pt" o:hralign="center" o:hrstd="t" o:hr="t" fillcolor="#a0a0a0" stroked="f"/>
+          <v:rect id="_x0000_i1113" style="width:0;height:1.5pt" o:hralign="center" o:hrstd="t" o:hr="t" fillcolor="#a0a0a0" stroked="f"/>
         </w:pict>
       </w:r>
     </w:p>
@@ -23827,7 +23827,7 @@
       </w:pPr>
       <w:r>
         <w:pict>
-          <v:rect id="_x0000_i1158" style="width:0;height:1.5pt" o:hralign="center" o:hrstd="t" o:hr="t" fillcolor="#a0a0a0" stroked="f"/>
+          <v:rect id="_x0000_i1114" style="width:0;height:1.5pt" o:hralign="center" o:hrstd="t" o:hr="t" fillcolor="#a0a0a0" stroked="f"/>
         </w:pict>
       </w:r>
     </w:p>
@@ -24237,7 +24237,7 @@
       </w:pPr>
       <w:r>
         <w:pict>
-          <v:rect id="_x0000_i1159" style="width:0;height:1.5pt" o:hralign="center" o:hrstd="t" o:hr="t" fillcolor="#a0a0a0" stroked="f"/>
+          <v:rect id="_x0000_i1115" style="width:0;height:1.5pt" o:hralign="center" o:hrstd="t" o:hr="t" fillcolor="#a0a0a0" stroked="f"/>
         </w:pict>
       </w:r>
     </w:p>
@@ -24643,7 +24643,7 @@
       </w:pPr>
       <w:r>
         <w:pict>
-          <v:rect id="_x0000_i1160" style="width:0;height:1.5pt" o:hralign="center" o:hrstd="t" o:hr="t" fillcolor="#a0a0a0" stroked="f"/>
+          <v:rect id="_x0000_i1116" style="width:0;height:1.5pt" o:hralign="center" o:hrstd="t" o:hr="t" fillcolor="#a0a0a0" stroked="f"/>
         </w:pict>
       </w:r>
     </w:p>
@@ -25144,7 +25144,7 @@
       <w:r>
         <w:lastRenderedPageBreak/>
         <w:pict>
-          <v:rect id="_x0000_i1161" style="width:0;height:1.5pt" o:hralign="center" o:hrstd="t" o:hr="t" fillcolor="#a0a0a0" stroked="f"/>
+          <v:rect id="_x0000_i1117" style="width:0;height:1.5pt" o:hralign="center" o:hrstd="t" o:hr="t" fillcolor="#a0a0a0" stroked="f"/>
         </w:pict>
       </w:r>
     </w:p>
@@ -26178,7 +26178,7 @@
     <w:p>
       <w:r>
         <w:pict>
-          <v:rect id="_x0000_i1162" style="width:0;height:1.5pt" o:hralign="center" o:hrstd="t" o:hr="t" fillcolor="#a0a0a0" stroked="f"/>
+          <v:rect id="_x0000_i1118" style="width:0;height:1.5pt" o:hralign="center" o:hrstd="t" o:hr="t" fillcolor="#a0a0a0" stroked="f"/>
         </w:pict>
       </w:r>
     </w:p>
@@ -27120,7 +27120,7 @@
       <w:r>
         <w:lastRenderedPageBreak/>
         <w:pict>
-          <v:rect id="_x0000_i1163" style="width:0;height:1.5pt" o:hralign="center" o:hrstd="t" o:hr="t" fillcolor="#a0a0a0" stroked="f"/>
+          <v:rect id="_x0000_i1119" style="width:0;height:1.5pt" o:hralign="center" o:hrstd="t" o:hr="t" fillcolor="#a0a0a0" stroked="f"/>
         </w:pict>
       </w:r>
     </w:p>
@@ -27347,7 +27347,7 @@
     <w:p>
       <w:r>
         <w:pict>
-          <v:rect id="_x0000_i1164" style="width:0;height:1.5pt" o:hralign="center" o:hrstd="t" o:hr="t" fillcolor="#a0a0a0" stroked="f"/>
+          <v:rect id="_x0000_i1120" style="width:0;height:1.5pt" o:hralign="center" o:hrstd="t" o:hr="t" fillcolor="#a0a0a0" stroked="f"/>
         </w:pict>
       </w:r>
     </w:p>
@@ -27489,7 +27489,7 @@
           <w:lang w:eastAsia="en-IN"/>
         </w:rPr>
         <w:pict>
-          <v:rect id="_x0000_i1089" style="width:0;height:1.5pt" o:hralign="center" o:hrstd="t" o:hr="t" fillcolor="#a0a0a0" stroked="f"/>
+          <v:rect id="_x0000_i1121" style="width:0;height:1.5pt" o:hralign="center" o:hrstd="t" o:hr="t" fillcolor="#a0a0a0" stroked="f"/>
         </w:pict>
       </w:r>
     </w:p>
@@ -27668,7 +27668,7 @@
           <w:lang w:eastAsia="en-IN"/>
         </w:rPr>
         <w:pict>
-          <v:rect id="_x0000_i1090" style="width:0;height:1.5pt" o:hralign="center" o:hrstd="t" o:hr="t" fillcolor="#a0a0a0" stroked="f"/>
+          <v:rect id="_x0000_i1122" style="width:0;height:1.5pt" o:hralign="center" o:hrstd="t" o:hr="t" fillcolor="#a0a0a0" stroked="f"/>
         </w:pict>
       </w:r>
     </w:p>
@@ -27709,16 +27709,7 @@
           <w:rFonts w:ascii="Times New Roman" w:eastAsia="Times New Roman" w:hAnsi="Times New Roman" w:cs="Times New Roman"/>
           <w:lang w:eastAsia="en-IN"/>
         </w:rPr>
-        <w:t xml:space="preserve">When array created, JVM assigns default </w:t>
-      </w:r>
-      <w:bookmarkStart w:id="0" w:name="_GoBack"/>
-      <w:bookmarkEnd w:id="0"/>
-      <w:r>
-        <w:rPr>
-          <w:rFonts w:ascii="Times New Roman" w:eastAsia="Times New Roman" w:hAnsi="Times New Roman" w:cs="Times New Roman"/>
-          <w:lang w:eastAsia="en-IN"/>
-        </w:rPr>
-        <w:t>values.</w:t>
+        <w:t>When array created, JVM assigns default values.</w:t>
       </w:r>
     </w:p>
     <w:tbl>
@@ -28213,7 +28204,7 @@
           <w:lang w:eastAsia="en-IN"/>
         </w:rPr>
         <w:pict>
-          <v:rect id="_x0000_i1091" style="width:0;height:1.5pt" o:hralign="center" o:hrstd="t" o:hr="t" fillcolor="#a0a0a0" stroked="f"/>
+          <v:rect id="_x0000_i1123" style="width:0;height:1.5pt" o:hralign="center" o:hrstd="t" o:hr="t" fillcolor="#a0a0a0" stroked="f"/>
         </w:pict>
       </w:r>
     </w:p>
@@ -28352,7 +28343,7 @@
           <w:lang w:eastAsia="en-IN"/>
         </w:rPr>
         <w:pict>
-          <v:rect id="_x0000_i1092" style="width:0;height:1.5pt" o:hralign="center" o:hrstd="t" o:hr="t" fillcolor="#a0a0a0" stroked="f"/>
+          <v:rect id="_x0000_i1124" style="width:0;height:1.5pt" o:hralign="center" o:hrstd="t" o:hr="t" fillcolor="#a0a0a0" stroked="f"/>
         </w:pict>
       </w:r>
     </w:p>
@@ -28451,7 +28442,7 @@
           <w:lang w:eastAsia="en-IN"/>
         </w:rPr>
         <w:pict>
-          <v:rect id="_x0000_i1093" style="width:0;height:1.5pt" o:hralign="center" o:hrstd="t" o:hr="t" fillcolor="#a0a0a0" stroked="f"/>
+          <v:rect id="_x0000_i1125" style="width:0;height:1.5pt" o:hralign="center" o:hrstd="t" o:hr="t" fillcolor="#a0a0a0" stroked="f"/>
         </w:pict>
       </w:r>
     </w:p>
@@ -28757,7 +28748,7 @@
           <w:lang w:eastAsia="en-IN"/>
         </w:rPr>
         <w:pict>
-          <v:rect id="_x0000_i1094" style="width:0;height:1.5pt" o:hralign="center" o:hrstd="t" o:hr="t" fillcolor="#a0a0a0" stroked="f"/>
+          <v:rect id="_x0000_i1126" style="width:0;height:1.5pt" o:hralign="center" o:hrstd="t" o:hr="t" fillcolor="#a0a0a0" stroked="f"/>
         </w:pict>
       </w:r>
     </w:p>
@@ -29173,7 +29164,7 @@
           <w:lang w:eastAsia="en-IN"/>
         </w:rPr>
         <w:pict>
-          <v:rect id="_x0000_i1095" style="width:0;height:1.5pt" o:hralign="center" o:hrstd="t" o:hr="t" fillcolor="#a0a0a0" stroked="f"/>
+          <v:rect id="_x0000_i1127" style="width:0;height:1.5pt" o:hralign="center" o:hrstd="t" o:hr="t" fillcolor="#a0a0a0" stroked="f"/>
         </w:pict>
       </w:r>
     </w:p>
@@ -29251,7 +29242,7 @@
           <w:lang w:eastAsia="en-IN"/>
         </w:rPr>
         <w:pict>
-          <v:rect id="_x0000_i1096" style="width:0;height:1.5pt" o:hralign="center" o:hrstd="t" o:hr="t" fillcolor="#a0a0a0" stroked="f"/>
+          <v:rect id="_x0000_i1128" style="width:0;height:1.5pt" o:hralign="center" o:hrstd="t" o:hr="t" fillcolor="#a0a0a0" stroked="f"/>
         </w:pict>
       </w:r>
     </w:p>
@@ -29306,7 +29297,7 @@
           <w:lang w:eastAsia="en-IN"/>
         </w:rPr>
         <w:pict>
-          <v:rect id="_x0000_i1097" style="width:0;height:1.5pt" o:hralign="center" o:hrstd="t" o:hr="t" fillcolor="#a0a0a0" stroked="f"/>
+          <v:rect id="_x0000_i1129" style="width:0;height:1.5pt" o:hralign="center" o:hrstd="t" o:hr="t" fillcolor="#a0a0a0" stroked="f"/>
         </w:pict>
       </w:r>
     </w:p>
@@ -29362,7 +29353,7 @@
           <w:lang w:eastAsia="en-IN"/>
         </w:rPr>
         <w:pict>
-          <v:rect id="_x0000_i1098" style="width:0;height:1.5pt" o:hralign="center" o:hrstd="t" o:hr="t" fillcolor="#a0a0a0" stroked="f"/>
+          <v:rect id="_x0000_i1130" style="width:0;height:1.5pt" o:hralign="center" o:hrstd="t" o:hr="t" fillcolor="#a0a0a0" stroked="f"/>
         </w:pict>
       </w:r>
     </w:p>
@@ -29417,7 +29408,7 @@
           <w:lang w:eastAsia="en-IN"/>
         </w:rPr>
         <w:pict>
-          <v:rect id="_x0000_i1099" style="width:0;height:1.5pt" o:hralign="center" o:hrstd="t" o:hr="t" fillcolor="#a0a0a0" stroked="f"/>
+          <v:rect id="_x0000_i1131" style="width:0;height:1.5pt" o:hralign="center" o:hrstd="t" o:hr="t" fillcolor="#a0a0a0" stroked="f"/>
         </w:pict>
       </w:r>
     </w:p>
@@ -29497,7 +29488,7 @@
           <w:lang w:eastAsia="en-IN"/>
         </w:rPr>
         <w:pict>
-          <v:rect id="_x0000_i1100" style="width:0;height:1.5pt" o:hralign="center" o:hrstd="t" o:hr="t" fillcolor="#a0a0a0" stroked="f"/>
+          <v:rect id="_x0000_i1132" style="width:0;height:1.5pt" o:hralign="center" o:hrstd="t" o:hr="t" fillcolor="#a0a0a0" stroked="f"/>
         </w:pict>
       </w:r>
     </w:p>
@@ -29555,7 +29546,7 @@
         </w:rPr>
         <w:lastRenderedPageBreak/>
         <w:pict>
-          <v:rect id="_x0000_i1101" style="width:0;height:1.5pt" o:hralign="center" o:hrstd="t" o:hr="t" fillcolor="#a0a0a0" stroked="f"/>
+          <v:rect id="_x0000_i1133" style="width:0;height:1.5pt" o:hralign="center" o:hrstd="t" o:hr="t" fillcolor="#a0a0a0" stroked="f"/>
         </w:pict>
       </w:r>
     </w:p>
@@ -29612,7 +29603,7 @@
           <w:lang w:eastAsia="en-IN"/>
         </w:rPr>
         <w:pict>
-          <v:rect id="_x0000_i1102" style="width:0;height:1.5pt" o:hralign="center" o:hrstd="t" o:hr="t" fillcolor="#a0a0a0" stroked="f"/>
+          <v:rect id="_x0000_i1134" style="width:0;height:1.5pt" o:hralign="center" o:hrstd="t" o:hr="t" fillcolor="#a0a0a0" stroked="f"/>
         </w:pict>
       </w:r>
     </w:p>
@@ -29667,7 +29658,7 @@
           <w:lang w:eastAsia="en-IN"/>
         </w:rPr>
         <w:pict>
-          <v:rect id="_x0000_i1103" style="width:0;height:1.5pt" o:hralign="center" o:hrstd="t" o:hr="t" fillcolor="#a0a0a0" stroked="f"/>
+          <v:rect id="_x0000_i1135" style="width:0;height:1.5pt" o:hralign="center" o:hrstd="t" o:hr="t" fillcolor="#a0a0a0" stroked="f"/>
         </w:pict>
       </w:r>
     </w:p>
@@ -29885,7 +29876,7 @@
           <w:lang w:eastAsia="en-IN"/>
         </w:rPr>
         <w:pict>
-          <v:rect id="_x0000_i1104" style="width:0;height:1.5pt" o:hralign="center" o:hrstd="t" o:hr="t" fillcolor="#a0a0a0" stroked="f"/>
+          <v:rect id="_x0000_i1136" style="width:0;height:1.5pt" o:hralign="center" o:hrstd="t" o:hr="t" fillcolor="#a0a0a0" stroked="f"/>
         </w:pict>
       </w:r>
     </w:p>
@@ -30093,7 +30084,7 @@
           <w:lang w:eastAsia="en-IN"/>
         </w:rPr>
         <w:pict>
-          <v:rect id="_x0000_i1105" style="width:0;height:1.5pt" o:hralign="center" o:hrstd="t" o:hr="t" fillcolor="#a0a0a0" stroked="f"/>
+          <v:rect id="_x0000_i1137" style="width:0;height:1.5pt" o:hralign="center" o:hrstd="t" o:hr="t" fillcolor="#a0a0a0" stroked="f"/>
         </w:pict>
       </w:r>
     </w:p>
@@ -30219,7 +30210,7 @@
           <w:lang w:eastAsia="en-IN"/>
         </w:rPr>
         <w:pict>
-          <v:rect id="_x0000_i1106" style="width:0;height:1.5pt" o:hralign="center" o:hrstd="t" o:hr="t" fillcolor="#a0a0a0" stroked="f"/>
+          <v:rect id="_x0000_i1138" style="width:0;height:1.5pt" o:hralign="center" o:hrstd="t" o:hr="t" fillcolor="#a0a0a0" stroked="f"/>
         </w:pict>
       </w:r>
     </w:p>
@@ -30410,7 +30401,7 @@
           <w:lang w:eastAsia="en-IN"/>
         </w:rPr>
         <w:pict>
-          <v:rect id="_x0000_i1107" style="width:0;height:1.5pt" o:hralign="center" o:hrstd="t" o:hr="t" fillcolor="#a0a0a0" stroked="f"/>
+          <v:rect id="_x0000_i1139" style="width:0;height:1.5pt" o:hralign="center" o:hrstd="t" o:hr="t" fillcolor="#a0a0a0" stroked="f"/>
         </w:pict>
       </w:r>
     </w:p>
@@ -30704,6 +30695,9 @@
     </w:p>
     <w:p>
       <w:pPr>
+        <w:pBdr>
+          <w:bottom w:val="single" w:sz="6" w:space="1" w:color="auto"/>
+        </w:pBdr>
         <w:spacing w:before="100" w:beforeAutospacing="1" w:after="100" w:afterAutospacing="1" w:line="240" w:lineRule="auto"/>
         <w:rPr>
           <w:rFonts w:ascii="Times New Roman" w:eastAsia="Times New Roman" w:hAnsi="Times New Roman" w:cs="Times New Roman"/>
@@ -30719,6 +30713,24 @@
       </w:r>
     </w:p>
     <w:p>
+      <w:pPr>
+        <w:spacing w:before="100" w:beforeAutospacing="1" w:after="100" w:afterAutospacing="1" w:line="240" w:lineRule="auto"/>
+        <w:rPr>
+          <w:rFonts w:ascii="Times New Roman" w:eastAsia="Times New Roman" w:hAnsi="Times New Roman" w:cs="Times New Roman"/>
+          <w:lang w:eastAsia="en-IN"/>
+        </w:rPr>
+      </w:pPr>
+      <w:r>
+        <w:rPr>
+          <w:rFonts w:ascii="Times New Roman" w:eastAsia="Times New Roman" w:hAnsi="Times New Roman" w:cs="Times New Roman"/>
+          <w:lang w:eastAsia="en-IN"/>
+        </w:rPr>
+        <w:t>Clear Concepts</w:t>
+      </w:r>
+      <w:bookmarkStart w:id="0" w:name="_GoBack"/>
+      <w:bookmarkEnd w:id="0"/>
+    </w:p>
+    <w:p>
       <w:r>
         <w:rPr>
           <w:highlight w:val="yellow"/>
@@ -30753,6 +30765,7 @@
           <w:sz w:val="22"/>
           <w:szCs w:val="22"/>
         </w:rPr>
+        <w:lastRenderedPageBreak/>
         <w:t xml:space="preserve">Ah, you’re asking about </w:t>
       </w:r>
       <w:r>
@@ -30773,9 +30786,8 @@
     </w:p>
     <w:p>
       <w:r>
-        <w:lastRenderedPageBreak/>
         <w:pict>
-          <v:rect id="_x0000_i1108" style="width:0;height:1.5pt" o:hralign="center" o:hrstd="t" o:hr="t" fillcolor="#a0a0a0" stroked="f"/>
+          <v:rect id="_x0000_i1140" style="width:0;height:1.5pt" o:hralign="center" o:hrstd="t" o:hr="t" fillcolor="#a0a0a0" stroked="f"/>
         </w:pict>
       </w:r>
     </w:p>
@@ -30966,7 +30978,7 @@
     <w:p>
       <w:r>
         <w:pict>
-          <v:rect id="_x0000_i1109" style="width:0;height:1.5pt" o:hralign="center" o:hrstd="t" o:hr="t" fillcolor="#a0a0a0" stroked="f"/>
+          <v:rect id="_x0000_i1141" style="width:0;height:1.5pt" o:hralign="center" o:hrstd="t" o:hr="t" fillcolor="#a0a0a0" stroked="f"/>
         </w:pict>
       </w:r>
     </w:p>
@@ -31269,8 +31281,9 @@
     </w:p>
     <w:p>
       <w:r>
+        <w:lastRenderedPageBreak/>
         <w:pict>
-          <v:rect id="_x0000_i1110" style="width:0;height:1.5pt" o:hralign="center" o:hrstd="t" o:hr="t" fillcolor="#a0a0a0" stroked="f"/>
+          <v:rect id="_x0000_i1142" style="width:0;height:1.5pt" o:hralign="center" o:hrstd="t" o:hr="t" fillcolor="#a0a0a0" stroked="f"/>
         </w:pict>
       </w:r>
     </w:p>
@@ -31279,7 +31292,6 @@
         <w:pStyle w:val="Heading3"/>
       </w:pPr>
       <w:r>
-        <w:lastRenderedPageBreak/>
         <w:t xml:space="preserve">Step 3: Creating another array </w:t>
       </w:r>
       <w:r>
@@ -31519,7 +31531,7 @@
     <w:p>
       <w:r>
         <w:pict>
-          <v:rect id="_x0000_i1111" style="width:0;height:1.5pt" o:hralign="center" o:hrstd="t" o:hr="t" fillcolor="#a0a0a0" stroked="f"/>
+          <v:rect id="_x0000_i1143" style="width:0;height:1.5pt" o:hralign="center" o:hrstd="t" o:hr="t" fillcolor="#a0a0a0" stroked="f"/>
         </w:pict>
       </w:r>
     </w:p>
@@ -31715,7 +31727,7 @@
     <w:p>
       <w:r>
         <w:pict>
-          <v:rect id="_x0000_i1112" style="width:0;height:1.5pt" o:hralign="center" o:hrstd="t" o:hr="t" fillcolor="#a0a0a0" stroked="f"/>
+          <v:rect id="_x0000_i1144" style="width:0;height:1.5pt" o:hralign="center" o:hrstd="t" o:hr="t" fillcolor="#a0a0a0" stroked="f"/>
         </w:pict>
       </w:r>
     </w:p>
@@ -31727,6 +31739,7 @@
         <w:rPr>
           <w:rFonts w:ascii="Cambria" w:hAnsi="Cambria" w:cs="Cambria"/>
         </w:rPr>
+        <w:lastRenderedPageBreak/>
         <w:t>✅</w:t>
       </w:r>
       <w:r>
@@ -31827,7 +31840,6 @@
           <w:sz w:val="22"/>
           <w:szCs w:val="22"/>
         </w:rPr>
-        <w:lastRenderedPageBreak/>
         <w:t>Array content equality does NOT mean reference equality</w:t>
       </w:r>
       <w:r>
@@ -31987,7 +31999,7 @@
     <w:p>
       <w:r>
         <w:pict>
-          <v:rect id="_x0000_i1113" style="width:0;height:1.5pt" o:hralign="center" o:hrstd="t" o:hr="t" fillcolor="#a0a0a0" stroked="f"/>
+          <v:rect id="_x0000_i1145" style="width:0;height:1.5pt" o:hralign="center" o:hrstd="t" o:hr="t" fillcolor="#a0a0a0" stroked="f"/>
         </w:pict>
       </w:r>
     </w:p>
@@ -32067,7 +32079,7 @@
     <w:p>
       <w:r>
         <w:pict>
-          <v:rect id="_x0000_i1114" style="width:0;height:1.5pt" o:hralign="center" o:hrstd="t" o:hr="t" fillcolor="#a0a0a0" stroked="f"/>
+          <v:rect id="_x0000_i1146" style="width:0;height:1.5pt" o:hralign="center" o:hrstd="t" o:hr="t" fillcolor="#a0a0a0" stroked="f"/>
         </w:pict>
       </w:r>
     </w:p>
@@ -32123,6 +32135,7 @@
           <w:sz w:val="22"/>
           <w:szCs w:val="22"/>
         </w:rPr>
+        <w:lastRenderedPageBreak/>
         <w:t>int[</w:t>
       </w:r>
       <w:proofErr w:type="gramEnd"/>
@@ -32214,7 +32227,6 @@
           <w:sz w:val="22"/>
           <w:szCs w:val="22"/>
         </w:rPr>
-        <w:lastRenderedPageBreak/>
         <w:t>c</w:t>
       </w:r>
       <w:proofErr w:type="gramEnd"/>
@@ -32454,7 +32466,7 @@
     <w:p>
       <w:r>
         <w:pict>
-          <v:rect id="_x0000_i1115" style="width:0;height:1.5pt" o:hralign="center" o:hrstd="t" o:hr="t" fillcolor="#a0a0a0" stroked="f"/>
+          <v:rect id="_x0000_i1147" style="width:0;height:1.5pt" o:hralign="center" o:hrstd="t" o:hr="t" fillcolor="#a0a0a0" stroked="f"/>
         </w:pict>
       </w:r>
     </w:p>
@@ -32657,6 +32669,7 @@
           <w:sz w:val="22"/>
           <w:szCs w:val="22"/>
         </w:rPr>
+        <w:lastRenderedPageBreak/>
         <w:t>Array contents now: [99, 20, 30, 40]</w:t>
       </w:r>
     </w:p>
@@ -32673,7 +32686,6 @@
           <w:sz w:val="22"/>
           <w:szCs w:val="22"/>
         </w:rPr>
-        <w:lastRenderedPageBreak/>
         <w:t>Memory addresses don’t change:</w:t>
       </w:r>
     </w:p>
@@ -32855,7 +32867,7 @@
     <w:p>
       <w:r>
         <w:pict>
-          <v:rect id="_x0000_i1116" style="width:0;height:1.5pt" o:hralign="center" o:hrstd="t" o:hr="t" fillcolor="#a0a0a0" stroked="f"/>
+          <v:rect id="_x0000_i1148" style="width:0;height:1.5pt" o:hralign="center" o:hrstd="t" o:hr="t" fillcolor="#a0a0a0" stroked="f"/>
         </w:pict>
       </w:r>
     </w:p>
@@ -33254,7 +33266,7 @@
     <w:p>
       <w:r>
         <w:pict>
-          <v:rect id="_x0000_i1117" style="width:0;height:1.5pt" o:hralign="center" o:hrstd="t" o:hr="t" fillcolor="#a0a0a0" stroked="f"/>
+          <v:rect id="_x0000_i1149" style="width:0;height:1.5pt" o:hralign="center" o:hrstd="t" o:hr="t" fillcolor="#a0a0a0" stroked="f"/>
         </w:pict>
       </w:r>
     </w:p>
@@ -33325,7 +33337,7 @@
     <w:p>
       <w:r>
         <w:pict>
-          <v:rect id="_x0000_i1118" style="width:0;height:1.5pt" o:hralign="center" o:hrstd="t" o:hr="t" fillcolor="#a0a0a0" stroked="f"/>
+          <v:rect id="_x0000_i1150" style="width:0;height:1.5pt" o:hralign="center" o:hrstd="t" o:hr="t" fillcolor="#a0a0a0" stroked="f"/>
         </w:pict>
       </w:r>
     </w:p>
@@ -33447,7 +33459,7 @@
       <w:r>
         <w:lastRenderedPageBreak/>
         <w:pict>
-          <v:rect id="_x0000_i1119" style="width:0;height:1.5pt" o:hralign="center" o:hrstd="t" o:hr="t" fillcolor="#a0a0a0" stroked="f"/>
+          <v:rect id="_x0000_i1151" style="width:0;height:1.5pt" o:hralign="center" o:hrstd="t" o:hr="t" fillcolor="#a0a0a0" stroked="f"/>
         </w:pict>
       </w:r>
     </w:p>
@@ -33838,7 +33850,7 @@
     <w:p>
       <w:r>
         <w:pict>
-          <v:rect id="_x0000_i1120" style="width:0;height:1.5pt" o:hralign="center" o:hrstd="t" o:hr="t" fillcolor="#a0a0a0" stroked="f"/>
+          <v:rect id="_x0000_i1152" style="width:0;height:1.5pt" o:hralign="center" o:hrstd="t" o:hr="t" fillcolor="#a0a0a0" stroked="f"/>
         </w:pict>
       </w:r>
     </w:p>
@@ -34065,7 +34077,7 @@
     <w:p>
       <w:r>
         <w:pict>
-          <v:rect id="_x0000_i1121" style="width:0;height:1.5pt" o:hralign="center" o:hrstd="t" o:hr="t" fillcolor="#a0a0a0" stroked="f"/>
+          <v:rect id="_x0000_i1153" style="width:0;height:1.5pt" o:hralign="center" o:hrstd="t" o:hr="t" fillcolor="#a0a0a0" stroked="f"/>
         </w:pict>
       </w:r>
     </w:p>
@@ -34425,7 +34437,7 @@
     <w:p>
       <w:r>
         <w:pict>
-          <v:rect id="_x0000_i1122" style="width:0;height:1.5pt" o:hralign="center" o:hrstd="t" o:hr="t" fillcolor="#a0a0a0" stroked="f"/>
+          <v:rect id="_x0000_i1154" style="width:0;height:1.5pt" o:hralign="center" o:hrstd="t" o:hr="t" fillcolor="#a0a0a0" stroked="f"/>
         </w:pict>
       </w:r>
     </w:p>
@@ -34770,7 +34782,7 @@
     <w:p>
       <w:r>
         <w:pict>
-          <v:rect id="_x0000_i1123" style="width:0;height:1.5pt" o:hralign="center" o:hrstd="t" o:hr="t" fillcolor="#a0a0a0" stroked="f"/>
+          <v:rect id="_x0000_i1155" style="width:0;height:1.5pt" o:hralign="center" o:hrstd="t" o:hr="t" fillcolor="#a0a0a0" stroked="f"/>
         </w:pict>
       </w:r>
     </w:p>
@@ -34970,7 +34982,7 @@
     <w:p>
       <w:r>
         <w:pict>
-          <v:rect id="_x0000_i1124" style="width:0;height:1.5pt" o:hralign="center" o:hrstd="t" o:hr="t" fillcolor="#a0a0a0" stroked="f"/>
+          <v:rect id="_x0000_i1156" style="width:0;height:1.5pt" o:hralign="center" o:hrstd="t" o:hr="t" fillcolor="#a0a0a0" stroked="f"/>
         </w:pict>
       </w:r>
     </w:p>
@@ -36044,7 +36056,7 @@
     <w:p>
       <w:r>
         <w:pict>
-          <v:rect id="_x0000_i1125" style="width:0;height:1.5pt" o:hralign="center" o:hrstd="t" o:hr="t" fillcolor="#a0a0a0" stroked="f"/>
+          <v:rect id="_x0000_i1157" style="width:0;height:1.5pt" o:hralign="center" o:hrstd="t" o:hr="t" fillcolor="#a0a0a0" stroked="f"/>
         </w:pict>
       </w:r>
     </w:p>
@@ -36608,7 +36620,7 @@
     <w:p>
       <w:r>
         <w:pict>
-          <v:rect id="_x0000_i1126" style="width:0;height:1.5pt" o:hralign="center" o:hrstd="t" o:hr="t" fillcolor="#a0a0a0" stroked="f"/>
+          <v:rect id="_x0000_i1158" style="width:0;height:1.5pt" o:hralign="center" o:hrstd="t" o:hr="t" fillcolor="#a0a0a0" stroked="f"/>
         </w:pict>
       </w:r>
     </w:p>
@@ -37155,7 +37167,7 @@
       </w:pPr>
       <w:r>
         <w:pict>
-          <v:rect id="_x0000_i1127" style="width:0;height:1.5pt" o:hralign="center" o:hrstd="t" o:hr="t" fillcolor="#a0a0a0" stroked="f"/>
+          <v:rect id="_x0000_i1159" style="width:0;height:1.5pt" o:hralign="center" o:hrstd="t" o:hr="t" fillcolor="#a0a0a0" stroked="f"/>
         </w:pict>
       </w:r>
     </w:p>
@@ -37658,7 +37670,7 @@
     <w:p>
       <w:r>
         <w:pict>
-          <v:rect id="_x0000_i1128" style="width:0;height:1.5pt" o:hralign="center" o:hrstd="t" o:hr="t" fillcolor="#a0a0a0" stroked="f"/>
+          <v:rect id="_x0000_i1160" style="width:0;height:1.5pt" o:hralign="center" o:hrstd="t" o:hr="t" fillcolor="#a0a0a0" stroked="f"/>
         </w:pict>
       </w:r>
     </w:p>
@@ -38211,7 +38223,7 @@
       <w:r>
         <w:lastRenderedPageBreak/>
         <w:pict>
-          <v:rect id="_x0000_i1129" style="width:0;height:1.5pt" o:hralign="center" o:hrstd="t" o:hr="t" fillcolor="#a0a0a0" stroked="f"/>
+          <v:rect id="_x0000_i1161" style="width:0;height:1.5pt" o:hralign="center" o:hrstd="t" o:hr="t" fillcolor="#a0a0a0" stroked="f"/>
         </w:pict>
       </w:r>
     </w:p>
@@ -38739,7 +38751,7 @@
     <w:p>
       <w:r>
         <w:pict>
-          <v:rect id="_x0000_i1130" style="width:0;height:1.5pt" o:hralign="center" o:hrstd="t" o:hr="t" fillcolor="#a0a0a0" stroked="f"/>
+          <v:rect id="_x0000_i1162" style="width:0;height:1.5pt" o:hralign="center" o:hrstd="t" o:hr="t" fillcolor="#a0a0a0" stroked="f"/>
         </w:pict>
       </w:r>
     </w:p>
@@ -39368,7 +39380,7 @@
     <w:p>
       <w:r>
         <w:pict>
-          <v:rect id="_x0000_i1131" style="width:0;height:1.5pt" o:hralign="center" o:hrstd="t" o:hr="t" fillcolor="#a0a0a0" stroked="f"/>
+          <v:rect id="_x0000_i1163" style="width:0;height:1.5pt" o:hralign="center" o:hrstd="t" o:hr="t" fillcolor="#a0a0a0" stroked="f"/>
         </w:pict>
       </w:r>
     </w:p>
@@ -39856,7 +39868,7 @@
     <w:p>
       <w:r>
         <w:pict>
-          <v:rect id="_x0000_i1132" style="width:0;height:1.5pt" o:hralign="center" o:hrstd="t" o:hr="t" fillcolor="#a0a0a0" stroked="f"/>
+          <v:rect id="_x0000_i1164" style="width:0;height:1.5pt" o:hralign="center" o:hrstd="t" o:hr="t" fillcolor="#a0a0a0" stroked="f"/>
         </w:pict>
       </w:r>
     </w:p>
@@ -40237,7 +40249,7 @@
           <w:rPr>
             <w:noProof/>
           </w:rPr>
-          <w:t>61</w:t>
+          <w:t>69</w:t>
         </w:r>
         <w:r>
           <w:rPr>

</xml_diff>